<commit_message>
feat: added non technical senarios
</commit_message>
<xml_diff>
--- a/HRMS_Agent_LiveKit_Voice_Integration_Proposal.docx
+++ b/HRMS_Agent_LiveKit_Voice_Integration_Proposal.docx
@@ -28,7 +28,118 @@
         <w:pStyle w:val="Heading1"/>
       </w:pPr>
       <w:r>
-        <w:t>2. Current State</w:t>
+        <w:t>2. In Plain English</w:t>
+      </w:r>
+    </w:p>
+    <w:p>
+      <w:r>
+        <w:t>Today, employees use the HRMS by typing in a chat: "Apply for leave tomorrow" or "What is my leave balance?" With this project, we add a "Voice Mode" button. When someone clicks it, they can do the same things by speaking instead of typing. The assistant hears them, looks up the same policies and data, and can even ask for approval by voice (e.g. "Say approve or reject"). If the user interrupts while the assistant is talking, the system handles it naturally—just like a real phone call. Everything stays in one place: one chat, one conversation, whether they type or talk.</w:t>
+      </w:r>
+    </w:p>
+    <w:p>
+      <w:pPr>
+        <w:pStyle w:val="Heading1"/>
+      </w:pPr>
+      <w:r>
+        <w:t>3. User Stories</w:t>
+      </w:r>
+    </w:p>
+    <w:p>
+      <w:r>
+        <w:t>These are examples of what users will be able to do once Voice Mode is live:</w:t>
+      </w:r>
+    </w:p>
+    <w:p>
+      <w:pPr>
+        <w:pStyle w:val="ListBullet"/>
+      </w:pPr>
+      <w:r>
+        <w:t>As an employee, I want to click "Voice Mode" in the chat so that I can apply for leave or check my balance by speaking, especially when I am on the go or prefer not to type.</w:t>
+      </w:r>
+    </w:p>
+    <w:p>
+      <w:pPr>
+        <w:pStyle w:val="ListBullet"/>
+      </w:pPr>
+      <w:r>
+        <w:t>As an admin, I want to approve leave or attendance by voice so that I can handle requests quickly without switching to the keyboard.</w:t>
+      </w:r>
+    </w:p>
+    <w:p>
+      <w:pPr>
+        <w:pStyle w:val="ListBullet"/>
+      </w:pPr>
+      <w:r>
+        <w:t>As an employee, I want to interrupt the assistant when it is talking so that I can correct something or ask a follow-up question without waiting for it to finish.</w:t>
+      </w:r>
+    </w:p>
+    <w:p>
+      <w:pPr>
+        <w:pStyle w:val="ListBullet"/>
+      </w:pPr>
+      <w:r>
+        <w:t>As a manager, I want the voice conversation to appear in the same chat thread as text so that my team and I have one continuous record of what was requested and approved.</w:t>
+      </w:r>
+    </w:p>
+    <w:p>
+      <w:pPr>
+        <w:pStyle w:val="Heading1"/>
+      </w:pPr>
+      <w:r>
+        <w:t>4. Example Scenario: A Day with Voice Mode</w:t>
+      </w:r>
+    </w:p>
+    <w:p>
+      <w:r>
+        <w:t>Neha opens the HRMS chat on her phone during her commute. She has already been chatting with the assistant about leave. She taps "Voice Mode," and the assistant says: "You're now in voice mode. How can I help?" Neha says: "Apply for sick leave tomorrow." The assistant repeats the details and asks her to confirm. She says "Yes." The assistant confirms the leave is submitted. Neha asks: "What about my balance?" Before the assistant finishes reading the full balance, Neha interrupts: "Just sick leave." The assistant replies with only the sick leave balance. Neha taps "End voice" and sees the whole exchange in the same chat as text. She can continue typing or start voice again later—all in one place.</w:t>
+      </w:r>
+    </w:p>
+    <w:p>
+      <w:pPr>
+        <w:pStyle w:val="Heading1"/>
+      </w:pPr>
+      <w:r>
+        <w:t>5. Why This Matters for the Business</w:t>
+      </w:r>
+    </w:p>
+    <w:p>
+      <w:pPr>
+        <w:pStyle w:val="ListBullet"/>
+      </w:pPr>
+      <w:r>
+        <w:t>More employees can use the HRMS when typing is difficult (driving, factory floor, accessibility needs).</w:t>
+      </w:r>
+    </w:p>
+    <w:p>
+      <w:pPr>
+        <w:pStyle w:val="ListBullet"/>
+      </w:pPr>
+      <w:r>
+        <w:t>Faster handling of simple requests (leave, balance, policy questions) without opening multiple screens.</w:t>
+      </w:r>
+    </w:p>
+    <w:p>
+      <w:pPr>
+        <w:pStyle w:val="ListBullet"/>
+      </w:pPr>
+      <w:r>
+        <w:t>Same rules and approvals in voice as in chat—no separate process to maintain.</w:t>
+      </w:r>
+    </w:p>
+    <w:p>
+      <w:pPr>
+        <w:pStyle w:val="ListBullet"/>
+      </w:pPr>
+      <w:r>
+        <w:t>One conversation history for both text and voice, so support and audits stay simple.</w:t>
+      </w:r>
+    </w:p>
+    <w:p>
+      <w:pPr>
+        <w:pStyle w:val="Heading1"/>
+      </w:pPr>
+      <w:r>
+        <w:t>6. Current State (Technical Context)</w:t>
       </w:r>
     </w:p>
     <w:p>
@@ -70,7 +181,7 @@
         <w:pStyle w:val="Heading1"/>
       </w:pPr>
       <w:r>
-        <w:t>3. Proposed Solution: Voice Mode in Chat</w:t>
+        <w:t>7. Proposed Solution: Voice Mode in Chat</w:t>
       </w:r>
     </w:p>
     <w:p>
@@ -141,7 +252,7 @@
         <w:pStyle w:val="Heading1"/>
       </w:pPr>
       <w:r>
-        <w:t>4. Technical Approach</w:t>
+        <w:t>8. Technical Approach (For the Technical Team)</w:t>
       </w:r>
     </w:p>
     <w:p>
@@ -149,7 +260,7 @@
         <w:pStyle w:val="Heading2"/>
       </w:pPr>
       <w:r>
-        <w:t>4.1 Architecture</w:t>
+        <w:t>8.1 Architecture</w:t>
       </w:r>
     </w:p>
     <w:p>
@@ -167,7 +278,7 @@
         <w:pStyle w:val="Heading2"/>
       </w:pPr>
       <w:r>
-        <w:t>4.2 Frontend Integration</w:t>
+        <w:t>8.2 Frontend Integration</w:t>
       </w:r>
     </w:p>
     <w:p>
@@ -180,7 +291,7 @@
         <w:pStyle w:val="Heading2"/>
       </w:pPr>
       <w:r>
-        <w:t>4.3 Backend Changes</w:t>
+        <w:t>8.3 Backend Changes</w:t>
       </w:r>
     </w:p>
     <w:p>
@@ -193,7 +304,7 @@
         <w:pStyle w:val="Heading1"/>
       </w:pPr>
       <w:r>
-        <w:t>5. Scope and Deliverables</w:t>
+        <w:t>9. Scope and Deliverables</w:t>
       </w:r>
     </w:p>
     <w:p>
@@ -233,7 +344,7 @@
         <w:pStyle w:val="Heading1"/>
       </w:pPr>
       <w:r>
-        <w:t>6. Risks and Mitigations</w:t>
+        <w:t>10. Risks and Mitigations</w:t>
       </w:r>
     </w:p>
     <w:p>
@@ -246,7 +357,7 @@
         <w:pStyle w:val="Heading1"/>
       </w:pPr>
       <w:r>
-        <w:t>7. Timeline (High-Level)</w:t>
+        <w:t>11. Timeline (High-Level)</w:t>
       </w:r>
     </w:p>
     <w:p>
@@ -259,7 +370,7 @@
         <w:pStyle w:val="Heading1"/>
       </w:pPr>
       <w:r>
-        <w:t>8. Conclusion</w:t>
+        <w:t>12. Conclusion</w:t>
       </w:r>
     </w:p>
     <w:p>

</xml_diff>